<commit_message>
docs: add section 4.4 algorithm design and flowchart image to manuscript docx
</commit_message>
<xml_diff>
--- a/MatchSpace_Manuscript_Section5-8.docx
+++ b/MatchSpace_Manuscript_Section5-8.docx
@@ -4,7 +4,7 @@
   <w:body>
     <w:p>
       <w:pPr>
-        <w:spacing w:after="200" w:before="100"/>
+        <w:spacing w:after="160" w:before="100"/>
         <w:jc w:val="center"/>
       </w:pPr>
       <w:r>
@@ -33,13 +33,13 @@
           <w:sz w:val="24"/>
           <w:szCs w:val="24"/>
         </w:rPr>
-        <w:t xml:space="preserve">หมวดที่ 5 ถึง 8: ผลการดำเนินงาน, อภิปรายผลและข้อจำกัด, สรุปและข้อเสนอแนะ, และบันทึกการใช้ AI</w:t>
+        <w:t xml:space="preserve">หมวดที่ 4 ถึง 8: การออกแบบขั้นตอนวิธี, ผลการดำเนินงาน, อภิปรายผล, สรุปและข้อเสนอแนะ, และบันทึกการใช้ AI</w:t>
       </w:r>
     </w:p>
     <w:p>
       <w:pPr>
         <w:pStyle w:val="Heading1"/>
-        <w:spacing w:after="120" w:before="240"/>
+        <w:spacing w:after="120" w:before="260"/>
       </w:pPr>
       <w:r>
         <w:rPr>
@@ -50,7 +50,7 @@
           <w:sz w:val="32"/>
           <w:szCs w:val="32"/>
         </w:rPr>
-        <w:t xml:space="preserve">5. ผลการดำเนินงาน (Results)</w:t>
+        <w:t xml:space="preserve">4.4 การออกแบบขั้นตอนวิธี (Algorithm Design)</w:t>
       </w:r>
     </w:p>
     <w:p>
@@ -64,253 +64,226 @@
           <w:sz w:val="24"/>
           <w:szCs w:val="24"/>
         </w:rPr>
-        <w:t xml:space="preserve">การพัฒนาเว็บแอปพลิเคชัน MatchSpace มีผลการดำเนินงานที่เสร็จสมบูรณ์ตามขอบเขตและวัตถุประสงค์ของโครงการ โดยระบบสามารถทำงานได้อย่างมีเสถียรภาพ รองรับการใช้งานแบบ Responsive Web Application ทั้งบนคอมพิวเตอร์และสมาร์ทโฟน โดยมีขั้นตอนการใช้งานและฟังก์ชันหลักของระบบ แบ่งออกเป็นแต่ละด้าน ดังนี้</w:t>
-      </w:r>
-    </w:p>
-    <w:p>
-      <w:pPr>
-        <w:pStyle w:val="ListParagraph"/>
-        <w:numPr>
-          <w:ilvl w:val="0"/>
-          <w:numId w:val="1"/>
-        </w:numPr>
-        <w:spacing w:after="40" w:before="40" w:line="300"/>
-      </w:pPr>
-      <w:r>
-        <w:rPr>
-          <w:rFonts w:ascii="TH Sarabun New" w:cs="TH Sarabun New" w:eastAsia="TH Sarabun New" w:hAnsi="TH Sarabun New"/>
-          <w:b/>
-          <w:bCs/>
-          <w:color w:val="111827"/>
-          <w:sz w:val="24"/>
-          <w:szCs w:val="24"/>
-        </w:rPr>
-        <w:t xml:space="preserve">1. ระบบการลงทะเบียนและการยืนยันตัวตนนักศึกษา (Authentication &amp; Verification): </w:t>
-      </w:r>
-      <w:r>
-        <w:rPr>
-          <w:rFonts w:ascii="TH Sarabun New" w:cs="TH Sarabun New" w:eastAsia="TH Sarabun New" w:hAnsi="TH Sarabun New"/>
-          <w:color w:val="374151"/>
-          <w:sz w:val="24"/>
-          <w:szCs w:val="24"/>
-        </w:rPr>
-        <w:t xml:space="preserve">ผู้ใช้สามารถลงทะเบียนและเข้าสู่ระบบด้วยอีเมลและรหัสผ่าน หรือผ่านระบบ Google Sign-In โดยมีระบบความปลอดภัยผ่านการยืนยันรหัสนักศึกษาด้วยรหัสผ่านใช้ครั้งเดียว (OTP) ที่ส่งไปยังอีเมลทางการของมหาวิทยาลัย (@kkumail.com หรือโดเมน .ac.th) เพื่อคัดกรองเฉพาะนักศึกษาจริงในสถาบันและป้องกันปัญหาบัญชีปลอม</w:t>
-      </w:r>
-    </w:p>
-    <w:p>
-      <w:pPr>
-        <w:pStyle w:val="ListParagraph"/>
-        <w:numPr>
-          <w:ilvl w:val="0"/>
-          <w:numId w:val="1"/>
-        </w:numPr>
-        <w:spacing w:after="40" w:before="40" w:line="300"/>
-      </w:pPr>
-      <w:r>
-        <w:rPr>
-          <w:rFonts w:ascii="TH Sarabun New" w:cs="TH Sarabun New" w:eastAsia="TH Sarabun New" w:hAnsi="TH Sarabun New"/>
-          <w:b/>
-          <w:bCs/>
-          <w:color w:val="111827"/>
-          <w:sz w:val="24"/>
-          <w:szCs w:val="24"/>
-        </w:rPr>
-        <w:t xml:space="preserve">2. ระบบจัดการโปรไฟล์และระบุความสนใจ (Profile &amp; Lifestyle Customization): </w:t>
-      </w:r>
-      <w:r>
-        <w:rPr>
-          <w:rFonts w:ascii="TH Sarabun New" w:cs="TH Sarabun New" w:eastAsia="TH Sarabun New" w:hAnsi="TH Sarabun New"/>
-          <w:color w:val="374151"/>
-          <w:sz w:val="24"/>
-          <w:szCs w:val="24"/>
-        </w:rPr>
-        <w:t xml:space="preserve">ผู้ใช้งานสามารถกรอกข้อมูลส่วนตัว คณะ ชั้นปี วันเดือนปีเกิด อัตลักษณ์เพศ และความสนใจทางเพศ พร้อมทั้งเลือกแท็กความสนใจ (Lifestyle Tags) เช่น ดนตรี กีฬา การอ่าน คาเฟ่ เกม อนิเมะ เพื่อนำข้อมูลไปใช้ในระบบประมวลผลความเข้ากันได้</w:t>
-      </w:r>
-    </w:p>
-    <w:p>
-      <w:pPr>
-        <w:pStyle w:val="ListParagraph"/>
-        <w:numPr>
-          <w:ilvl w:val="0"/>
-          <w:numId w:val="1"/>
-        </w:numPr>
-        <w:spacing w:after="40" w:before="40" w:line="300"/>
-      </w:pPr>
-      <w:r>
-        <w:rPr>
-          <w:rFonts w:ascii="TH Sarabun New" w:cs="TH Sarabun New" w:eastAsia="TH Sarabun New" w:hAnsi="TH Sarabun New"/>
-          <w:b/>
-          <w:bCs/>
-          <w:color w:val="111827"/>
-          <w:sz w:val="24"/>
-          <w:szCs w:val="24"/>
-        </w:rPr>
-        <w:t xml:space="preserve">3. ระบบค้นหาและจับคู่ความสนใจ (Smart Matching System): </w:t>
-      </w:r>
-      <w:r>
-        <w:rPr>
-          <w:rFonts w:ascii="TH Sarabun New" w:cs="TH Sarabun New" w:eastAsia="TH Sarabun New" w:hAnsi="TH Sarabun New"/>
-          <w:color w:val="374151"/>
-          <w:sz w:val="24"/>
-          <w:szCs w:val="24"/>
-        </w:rPr>
-        <w:t xml:space="preserve">แสดงการ์ดข้อมูลโปรไฟล์ของผู้ใช้งานรายอื่นพร้อมระดับเปอร์เซ็นต์ความสอดคล้องของความสนใจ (Matching Compatibility Score) โดยผู้ใช้สามารถเลือกส่งคำขอเชื่อมต่อ (Connect/Like) หรือข้ามโปรไฟล์ เมื่อทั้งสองฝ่ายให้ความสนใจตรงกัน ระบบจะสร้างห้องสนทนาเพื่อเริ่มต้นพูดคุยโดยอัตโนมัติ</w:t>
-      </w:r>
-    </w:p>
-    <w:p>
-      <w:pPr>
-        <w:pStyle w:val="ListParagraph"/>
-        <w:numPr>
-          <w:ilvl w:val="0"/>
-          <w:numId w:val="1"/>
-        </w:numPr>
-        <w:spacing w:after="40" w:before="40" w:line="300"/>
-      </w:pPr>
-      <w:r>
-        <w:rPr>
-          <w:rFonts w:ascii="TH Sarabun New" w:cs="TH Sarabun New" w:eastAsia="TH Sarabun New" w:hAnsi="TH Sarabun New"/>
-          <w:b/>
-          <w:bCs/>
-          <w:color w:val="111827"/>
-          <w:sz w:val="24"/>
-          <w:szCs w:val="24"/>
-        </w:rPr>
-        <w:t xml:space="preserve">4. ระบบการสนทนาแบบทันที (Real-time Messaging System): </w:t>
-      </w:r>
-      <w:r>
-        <w:rPr>
-          <w:rFonts w:ascii="TH Sarabun New" w:cs="TH Sarabun New" w:eastAsia="TH Sarabun New" w:hAnsi="TH Sarabun New"/>
-          <w:color w:val="374151"/>
-          <w:sz w:val="24"/>
-          <w:szCs w:val="24"/>
-        </w:rPr>
-        <w:t xml:space="preserve">รองรับการรับ-ส่งข้อความและรูปภาพแบบทันที (Real-time) ผ่านเทคโนโลยี WebSockets พร้อมแสดงสถานะการอ่านข้อความ (Read Receipts) ระบุวัน-เวลาที่อ่าน รองรับทั้งการสนทนาส่วนตัว 1 ต่อ 1 และการสนทนากลุ่มย่อยตามกิจกรรม</w:t>
-      </w:r>
-    </w:p>
-    <w:p>
-      <w:pPr>
-        <w:pStyle w:val="ListParagraph"/>
-        <w:numPr>
-          <w:ilvl w:val="0"/>
-          <w:numId w:val="1"/>
-        </w:numPr>
-        <w:spacing w:after="40" w:before="40" w:line="300"/>
-      </w:pPr>
-      <w:r>
-        <w:rPr>
-          <w:rFonts w:ascii="TH Sarabun New" w:cs="TH Sarabun New" w:eastAsia="TH Sarabun New" w:hAnsi="TH Sarabun New"/>
-          <w:b/>
-          <w:bCs/>
-          <w:color w:val="111827"/>
-          <w:sz w:val="24"/>
-          <w:szCs w:val="24"/>
-        </w:rPr>
-        <w:t xml:space="preserve">5. ระบบสร้างและเข้าร่วมกิจกรรมกลุ่ม (Campus Community &amp; Activity Hub): </w:t>
-      </w:r>
-      <w:r>
-        <w:rPr>
-          <w:rFonts w:ascii="TH Sarabun New" w:cs="TH Sarabun New" w:eastAsia="TH Sarabun New" w:hAnsi="TH Sarabun New"/>
-          <w:color w:val="374151"/>
-          <w:sz w:val="24"/>
-          <w:szCs w:val="24"/>
-        </w:rPr>
-        <w:t xml:space="preserve">ผู้ใช้งานสามารถเปิดสร้างกิจกรรมสาธารณะภายในมหาวิทยาลัย เช่น กิจกรรมชวนอ่านหนังสือ ติวสอบ ไปคาเฟ่ หรือเล่นกีฬา โดยผู้ใช้อื่นสามารถส่งคำขอเข้าร่วม มีระบบจำกัดจำนวนคน และเปิดห้องแชตกลุ่มสำหรับกิจกรรมนั้น ๆ โดยอัตโนมัติ</w:t>
-      </w:r>
-    </w:p>
-    <w:p>
-      <w:pPr>
-        <w:pStyle w:val="ListParagraph"/>
-        <w:numPr>
-          <w:ilvl w:val="0"/>
-          <w:numId w:val="1"/>
-        </w:numPr>
-        <w:spacing w:after="40" w:before="40" w:line="300"/>
-      </w:pPr>
-      <w:r>
-        <w:rPr>
-          <w:rFonts w:ascii="TH Sarabun New" w:cs="TH Sarabun New" w:eastAsia="TH Sarabun New" w:hAnsi="TH Sarabun New"/>
-          <w:b/>
-          <w:bCs/>
-          <w:color w:val="111827"/>
-          <w:sz w:val="24"/>
-          <w:szCs w:val="24"/>
-        </w:rPr>
-        <w:t xml:space="preserve">6. ระบบเหรียญรางวัลประเมินความน่าเชื่อถือ (Gamification &amp; Badges System): </w:t>
-      </w:r>
-      <w:r>
-        <w:rPr>
-          <w:rFonts w:ascii="TH Sarabun New" w:cs="TH Sarabun New" w:eastAsia="TH Sarabun New" w:hAnsi="TH Sarabun New"/>
-          <w:color w:val="374151"/>
-          <w:sz w:val="24"/>
-          <w:szCs w:val="24"/>
-        </w:rPr>
-        <w:t xml:space="preserve">ผู้ใช้สามารถมอบเหรียญตราเกียรติยศ (Badges) ให้แก่เพื่อนคู่สนทนาหรือสมาชิกในกิจกรรม เช่น "เพื่อนติวดีเด่น", "ตรงต่อเวลา", "เป็นมิตรยอดเยี่ยม" เพื่อสร้างสังคมเชิงบวกและเป็นคะแนนประเมินความปลอดภัยของบุคคล</w:t>
-      </w:r>
-    </w:p>
-    <w:p>
-      <w:pPr>
-        <w:pStyle w:val="ListParagraph"/>
-        <w:numPr>
-          <w:ilvl w:val="0"/>
-          <w:numId w:val="1"/>
-        </w:numPr>
-        <w:spacing w:after="40" w:before="40" w:line="300"/>
-      </w:pPr>
-      <w:r>
-        <w:rPr>
-          <w:rFonts w:ascii="TH Sarabun New" w:cs="TH Sarabun New" w:eastAsia="TH Sarabun New" w:hAnsi="TH Sarabun New"/>
-          <w:b/>
-          <w:bCs/>
-          <w:color w:val="111827"/>
-          <w:sz w:val="24"/>
-          <w:szCs w:val="24"/>
-        </w:rPr>
-        <w:t xml:space="preserve">7. ระบบความปลอดภัยและการรายงานปัญหา (Safety, Blocking &amp; Reporting): </w:t>
-      </w:r>
-      <w:r>
-        <w:rPr>
-          <w:rFonts w:ascii="TH Sarabun New" w:cs="TH Sarabun New" w:eastAsia="TH Sarabun New" w:hAnsi="TH Sarabun New"/>
-          <w:color w:val="374151"/>
-          <w:sz w:val="24"/>
-          <w:szCs w:val="24"/>
-        </w:rPr>
-        <w:t xml:space="preserve">ผู้ใช้สามารถปิดกั้น (Block) ผู้ใช้ที่มีพฤติกรรมไม่เหมาะสมได้ทันที และมีระบบรายงานปัญหา (Report System) พร้อมแนบหลักฐานภาพถ่าย เพื่อส่งให้ผู้ดูแลระบบตรวจสอบข้อเท็จจริง</w:t>
-      </w:r>
-    </w:p>
-    <w:p>
-      <w:pPr>
-        <w:pStyle w:val="ListParagraph"/>
-        <w:numPr>
-          <w:ilvl w:val="0"/>
-          <w:numId w:val="1"/>
-        </w:numPr>
-        <w:spacing w:after="40" w:before="40" w:line="300"/>
-      </w:pPr>
-      <w:r>
-        <w:rPr>
-          <w:rFonts w:ascii="TH Sarabun New" w:cs="TH Sarabun New" w:eastAsia="TH Sarabun New" w:hAnsi="TH Sarabun New"/>
-          <w:b/>
-          <w:bCs/>
-          <w:color w:val="111827"/>
-          <w:sz w:val="24"/>
-          <w:szCs w:val="24"/>
-        </w:rPr>
-        <w:t xml:space="preserve">8. ระบบแดชบอร์ดและการวิเคราะห์สถิติสำหรับผู้ดูแลระบบ (Admin &amp; Analytics Dashboard): </w:t>
-      </w:r>
-      <w:r>
-        <w:rPr>
-          <w:rFonts w:ascii="TH Sarabun New" w:cs="TH Sarabun New" w:eastAsia="TH Sarabun New" w:hAnsi="TH Sarabun New"/>
-          <w:color w:val="374151"/>
-          <w:sz w:val="24"/>
-          <w:szCs w:val="24"/>
-        </w:rPr>
-        <w:t xml:space="preserve">แสดงสถิติเชิงลึกผ่านกราฟ Interactive (Chart.js) จำแนกจำนวนผู้เข้าชมรายวัน (Daily Visitors) ทั้งยอดเปิดหน้า (Pageviews) และผู้ใช้ไม่ซ้ำคน (Unique Visitors) กราฟความหนาแน่น 24 ชั่วโมง (00:00 - 23:00 น.) พร้อมวิเคราะห์ช่วงเวลาที่มีผู้ใช้งานสูงสุด (Peak Usage Hours) สัดส่วนอุปกรณ์ และประวัติการเข้าชมแบบเรียลไทม์</w:t>
+        <w:t xml:space="preserve">การออกแบบขั้นตอนวิธีของระบบ MatchSpace มุ่งเน้นการประมวลผลที่มีลำดับขั้นตอนชัดเจน ปลอดภัย และมีประสิทธิภาพสูง เพื่อสนับสนุนการเชื่อมต่อมิตรภาพของนักศึกษาอย่างเป็นระบบ โดยแบ่งโครงสร้างขั้นตอนวิธีออกเป็น 5 ลำดับขั้นหลัก ดังนี้:</w:t>
+      </w:r>
+    </w:p>
+    <w:p>
+      <w:pPr>
+        <w:pStyle w:val="ListParagraph"/>
+        <w:numPr>
+          <w:ilvl w:val="0"/>
+          <w:numId w:val="1"/>
+        </w:numPr>
+        <w:spacing w:after="40" w:before="40" w:line="300"/>
+      </w:pPr>
+      <w:r>
+        <w:rPr>
+          <w:rFonts w:ascii="TH Sarabun New" w:cs="TH Sarabun New" w:eastAsia="TH Sarabun New" w:hAnsi="TH Sarabun New"/>
+          <w:b/>
+          <w:bCs/>
+          <w:color w:val="111827"/>
+          <w:sz w:val="24"/>
+          <w:szCs w:val="24"/>
+        </w:rPr>
+        <w:t xml:space="preserve">1. ขั้นตอนวิธีคัดกรองและยืนยันตัวตน (Authentication &amp; University Email Verification Algorithm): </w:t>
+      </w:r>
+      <w:r>
+        <w:rPr>
+          <w:rFonts w:ascii="TH Sarabun New" w:cs="TH Sarabun New" w:eastAsia="TH Sarabun New" w:hAnsi="TH Sarabun New"/>
+          <w:color w:val="374151"/>
+          <w:sz w:val="24"/>
+          <w:szCs w:val="24"/>
+        </w:rPr>
+        <w:t xml:space="preserve">เริ่มต้นเมื่อผู้ใช้ส่งคำขอเข้าใช้งาน ระบบตรวจสอบรูปแบบอีเมล หากระบุเป็นอีเมลนักศึกษา (@kkumail.com หรือ .ac.th) ระบบจะสุ่มสร้างรหัส OTP 6 หลัก และส่งไปยังกล่องจดหมายของผู้ใช้ โดยกำหนดอายุการใช้งาน (TTL: 5 นาที) เมื่อผู้ใช้กรอกรหัสถูกต้อง สถานะบัญชีจะได้รับการอัปเดตเป็น Verified Student เพื่อปลดล็อกฟังก์ชันในระบบ</w:t>
+      </w:r>
+    </w:p>
+    <w:p>
+      <w:pPr>
+        <w:pStyle w:val="ListParagraph"/>
+        <w:numPr>
+          <w:ilvl w:val="0"/>
+          <w:numId w:val="1"/>
+        </w:numPr>
+        <w:spacing w:after="40" w:before="40" w:line="300"/>
+      </w:pPr>
+      <w:r>
+        <w:rPr>
+          <w:rFonts w:ascii="TH Sarabun New" w:cs="TH Sarabun New" w:eastAsia="TH Sarabun New" w:hAnsi="TH Sarabun New"/>
+          <w:b/>
+          <w:bCs/>
+          <w:color w:val="111827"/>
+          <w:sz w:val="24"/>
+          <w:szCs w:val="24"/>
+        </w:rPr>
+        <w:t xml:space="preserve">2. ขั้นตอนวิธีคำนวณคะแนนความสอดคล้องของความสนใจ (Smart Compatibility Scoring Algorithm): </w:t>
+      </w:r>
+      <w:r>
+        <w:rPr>
+          <w:rFonts w:ascii="TH Sarabun New" w:cs="TH Sarabun New" w:eastAsia="TH Sarabun New" w:hAnsi="TH Sarabun New"/>
+          <w:color w:val="374151"/>
+          <w:sz w:val="24"/>
+          <w:szCs w:val="24"/>
+        </w:rPr>
+        <w:t xml:space="preserve">ระบบดึงข้อมูลแท็กความสนใจ (Lifestyle Tags) ของผู้ใช้งานและกลุ่มผู้ใช้เป้าหมายที่ตรงตามเงื่อนไขเพศและคณะ จากนั้นคำนวณคะแนนความสอดคล้องด้วยฟังก์ชันความคล้ายคลึงของชุดข้อมูล (Set Overlap Similarity Function): คะแนน = (จำนวนแท็กที่ตรงกัน ÷ จำนวนแท็กทั้งหมดที่เลือก) × 100 แล้วจัดลำดับผลลัพธ์จากคะแนนมากไปน้อย</w:t>
+      </w:r>
+    </w:p>
+    <w:p>
+      <w:pPr>
+        <w:pStyle w:val="ListParagraph"/>
+        <w:numPr>
+          <w:ilvl w:val="0"/>
+          <w:numId w:val="1"/>
+        </w:numPr>
+        <w:spacing w:after="40" w:before="40" w:line="300"/>
+      </w:pPr>
+      <w:r>
+        <w:rPr>
+          <w:rFonts w:ascii="TH Sarabun New" w:cs="TH Sarabun New" w:eastAsia="TH Sarabun New" w:hAnsi="TH Sarabun New"/>
+          <w:b/>
+          <w:bCs/>
+          <w:color w:val="111827"/>
+          <w:sz w:val="24"/>
+          <w:szCs w:val="24"/>
+        </w:rPr>
+        <w:t xml:space="preserve">3. ขั้นตอนวิธีการตัดสินใจและจับคู่สองทิศทาง (Bidirectional Matching Logic): </w:t>
+      </w:r>
+      <w:r>
+        <w:rPr>
+          <w:rFonts w:ascii="TH Sarabun New" w:cs="TH Sarabun New" w:eastAsia="TH Sarabun New" w:hAnsi="TH Sarabun New"/>
+          <w:color w:val="374151"/>
+          <w:sz w:val="24"/>
+          <w:szCs w:val="24"/>
+        </w:rPr>
+        <w:t xml:space="preserve">เมื่อระบบแสดงการ์ดโปรไฟล์ หากผู้ใช้เลือก "ข้าม (Skip)" ระบบจะบันทึกสถานะเพื่อไม่แสดงซ้ำ แต่หากผู้ใช้เลือก "เชื่อมต่อ (Connect/Like)" ระบบจะตรวจสอบเงื่อนไขความสัมพันธ์แบบสองทิศทาง (Mutual Match Verification) หากทั้งสองฝ่ายต่างกดถูกใจซึ่งกันและกัน ระบบจะทริกเกอร์สร้างห้องสนทนาส่วนตัว (Direct Chat Room) ขึ้นทันที</w:t>
+      </w:r>
+    </w:p>
+    <w:p>
+      <w:pPr>
+        <w:pStyle w:val="ListParagraph"/>
+        <w:numPr>
+          <w:ilvl w:val="0"/>
+          <w:numId w:val="1"/>
+        </w:numPr>
+        <w:spacing w:after="40" w:before="40" w:line="300"/>
+      </w:pPr>
+      <w:r>
+        <w:rPr>
+          <w:rFonts w:ascii="TH Sarabun New" w:cs="TH Sarabun New" w:eastAsia="TH Sarabun New" w:hAnsi="TH Sarabun New"/>
+          <w:b/>
+          <w:bCs/>
+          <w:color w:val="111827"/>
+          <w:sz w:val="24"/>
+          <w:szCs w:val="24"/>
+        </w:rPr>
+        <w:t xml:space="preserve">4. ขั้นตอนวิธีประสานงานและสื่อสารแบบทันที (Real-time WebSocket &amp; Activity Scheduling): </w:t>
+      </w:r>
+      <w:r>
+        <w:rPr>
+          <w:rFonts w:ascii="TH Sarabun New" w:cs="TH Sarabun New" w:eastAsia="TH Sarabun New" w:hAnsi="TH Sarabun New"/>
+          <w:color w:val="374151"/>
+          <w:sz w:val="24"/>
+          <w:szCs w:val="24"/>
+        </w:rPr>
+        <w:t xml:space="preserve">การสนทนาใช้โปรโตคอล WebSockets จัดการการเชื่อมต่อแบบ Persistent Connection เพื่อบรอดแคสต์ข้อความและอัปเดตสถานะการอ่าน (Read Receipts) ไปยัง Client ทันทีโดยไม่ต้อง Polling พร้อมทั้งมีระบบสร้างกิจกรรมกลุ่ม (Campus Activity) ที่จำกัดโควตาจำนวนสมาชิกตามเงื่อนไขที่ผู้สร้างกำหนด</w:t>
+      </w:r>
+    </w:p>
+    <w:p>
+      <w:pPr>
+        <w:pStyle w:val="ListParagraph"/>
+        <w:numPr>
+          <w:ilvl w:val="0"/>
+          <w:numId w:val="1"/>
+        </w:numPr>
+        <w:spacing w:after="40" w:before="40" w:line="300"/>
+      </w:pPr>
+      <w:r>
+        <w:rPr>
+          <w:rFonts w:ascii="TH Sarabun New" w:cs="TH Sarabun New" w:eastAsia="TH Sarabun New" w:hAnsi="TH Sarabun New"/>
+          <w:b/>
+          <w:bCs/>
+          <w:color w:val="111827"/>
+          <w:sz w:val="24"/>
+          <w:szCs w:val="24"/>
+        </w:rPr>
+        <w:t xml:space="preserve">5. ขั้นตอนวิธีดักจับและวิเคราะห์สถิติทราฟฟิก (Traffic Logging &amp; Peak-Hour Detection Algorithm): </w:t>
+      </w:r>
+      <w:r>
+        <w:rPr>
+          <w:rFonts w:ascii="TH Sarabun New" w:cs="TH Sarabun New" w:eastAsia="TH Sarabun New" w:hAnsi="TH Sarabun New"/>
+          <w:color w:val="374151"/>
+          <w:sz w:val="24"/>
+          <w:szCs w:val="24"/>
+        </w:rPr>
+        <w:t xml:space="preserve">ระบบติดตั้ง Middleware เพื่อดักจับทุกการเปิดหน้าเว็บ โดยใช้ In-Memory Cache ตรวจจับและระงับคำขอซ้ำจาก IP/Session เดียวกันภายใน 5 วินาที (Debouncing) จากนั้นรวบรวมสถิติแยกตามรายวันและช่วงเวลา 24 ชั่วโมง เพื่อคำนวณหาจุดที่มีความถี่สูงสุด (Max-Frequency Detection) และแสดงเป็นช่วงเวลาพีค (Peak Usage Hours) บนหน้าแดชบอร์ดผู้ดูแลระบบ</w:t>
+      </w:r>
+    </w:p>
+    <w:p>
+      <w:pPr>
+        <w:spacing w:after="100" w:before="200"/>
+        <w:jc w:val="center"/>
+      </w:pPr>
+      <w:r>
+        <w:drawing>
+          <wp:inline distT="0" distB="0" distL="0" distR="0">
+            <wp:extent cx="5524500" cy="3105150"/>
+            <wp:effectExtent t="0" r="0" b="0" l="0"/>
+            <wp:docPr id="1" name="" descr="" title=""/>
+            <wp:cNvGraphicFramePr>
+              <a:graphicFrameLocks xmlns:a="http://schemas.openxmlformats.org/drawingml/2006/main" noChangeAspect="1"/>
+            </wp:cNvGraphicFramePr>
+            <a:graphic xmlns:a="http://schemas.openxmlformats.org/drawingml/2006/main">
+              <a:graphicData uri="http://schemas.openxmlformats.org/drawingml/2006/picture">
+                <pic:pic xmlns:pic="http://schemas.openxmlformats.org/drawingml/2006/picture">
+                  <pic:nvPicPr>
+                    <pic:cNvPr id="0" name="" descr=""/>
+                    <pic:cNvPicPr>
+                      <a:picLocks noChangeAspect="1" noChangeArrowheads="1"/>
+                    </pic:cNvPicPr>
+                  </pic:nvPicPr>
+                  <pic:blipFill>
+                    <a:blip r:embed="rId7" cstate="none"/>
+                    <a:srcRect/>
+                    <a:stretch>
+                      <a:fillRect/>
+                    </a:stretch>
+                  </pic:blipFill>
+                  <pic:spPr bwMode="auto">
+                    <a:xfrm>
+                      <a:off x="0" y="0"/>
+                      <a:ext cx="5524500" cy="3105150"/>
+                    </a:xfrm>
+                    <a:prstGeom prst="rect">
+                      <a:avLst/>
+                    </a:prstGeom>
+                  </pic:spPr>
+                </pic:pic>
+              </a:graphicData>
+            </a:graphic>
+          </wp:inline>
+        </w:drawing>
+      </w:r>
+    </w:p>
+    <w:p>
+      <w:pPr>
+        <w:spacing w:after="240" w:before="60"/>
+        <w:jc w:val="center"/>
+      </w:pPr>
+      <w:r>
+        <w:rPr>
+          <w:rFonts w:ascii="TH Sarabun New" w:cs="TH Sarabun New" w:eastAsia="TH Sarabun New" w:hAnsi="TH Sarabun New"/>
+          <w:b/>
+          <w:bCs/>
+          <w:color w:val="4B5563"/>
+          <w:sz w:val="22"/>
+          <w:szCs w:val="22"/>
+        </w:rPr>
+        <w:t xml:space="preserve">รูปที่ 4.1 แผนภาพลำดับขั้นตอนการทำงานของระบบ MatchSpace (System Flowchart &amp; Algorithm Flow)</w:t>
       </w:r>
     </w:p>
     <w:p>
       <w:pPr>
         <w:pStyle w:val="Heading1"/>
-        <w:spacing w:after="120" w:before="240"/>
+        <w:spacing w:after="120" w:before="260"/>
       </w:pPr>
       <w:r>
         <w:rPr>
@@ -321,334 +294,267 @@
           <w:sz w:val="32"/>
           <w:szCs w:val="32"/>
         </w:rPr>
-        <w:t xml:space="preserve">6. อภิปรายผลและข้อจำกัด (Discussion &amp; Limitations)</w:t>
-      </w:r>
-    </w:p>
-    <w:p>
-      <w:pPr>
-        <w:pStyle w:val="Heading2"/>
-        <w:spacing w:after="80" w:before="180"/>
-      </w:pPr>
-      <w:r>
-        <w:rPr>
-          <w:rFonts w:ascii="TH Sarabun New" w:cs="TH Sarabun New" w:eastAsia="TH Sarabun New" w:hAnsi="TH Sarabun New"/>
-          <w:b/>
-          <w:bCs/>
-          <w:color w:val="374151"/>
-          <w:sz w:val="28"/>
-          <w:szCs w:val="28"/>
-        </w:rPr>
-        <w:t xml:space="preserve">6.1 อภิปรายจุดเด่นของระบบ (Strengths)</w:t>
-      </w:r>
-    </w:p>
-    <w:p>
-      <w:pPr>
-        <w:pStyle w:val="ListParagraph"/>
-        <w:numPr>
-          <w:ilvl w:val="0"/>
-          <w:numId w:val="1"/>
-        </w:numPr>
-        <w:spacing w:after="40" w:before="40" w:line="300"/>
-      </w:pPr>
-      <w:r>
-        <w:rPr>
-          <w:rFonts w:ascii="TH Sarabun New" w:cs="TH Sarabun New" w:eastAsia="TH Sarabun New" w:hAnsi="TH Sarabun New"/>
-          <w:b/>
-          <w:bCs/>
-          <w:color w:val="111827"/>
-          <w:sz w:val="24"/>
-          <w:szCs w:val="24"/>
-        </w:rPr>
-        <w:t xml:space="preserve">1. ความน่าเชื่อถือและความปลอดภัยสูง (High Trust &amp; Safety): </w:t>
-      </w:r>
-      <w:r>
-        <w:rPr>
-          <w:rFonts w:ascii="TH Sarabun New" w:cs="TH Sarabun New" w:eastAsia="TH Sarabun New" w:hAnsi="TH Sarabun New"/>
-          <w:color w:val="374151"/>
-          <w:sz w:val="24"/>
-          <w:szCs w:val="24"/>
-        </w:rPr>
-        <w:t xml:space="preserve">การผูกมัดการยืนยันตัวตนด้วยอีเมลสถาบันการศึกษา ช่วยลดปัญหาบัญชีหลุม (Fake Accounts) และการหลอกลวง ซึ่งเป็นจุดอ่อนสำคัญของแอปพลิเคชันหาเพื่อนทั่วไปในท้องตลาด</w:t>
-      </w:r>
-    </w:p>
-    <w:p>
-      <w:pPr>
-        <w:pStyle w:val="ListParagraph"/>
-        <w:numPr>
-          <w:ilvl w:val="0"/>
-          <w:numId w:val="1"/>
-        </w:numPr>
-        <w:spacing w:after="40" w:before="40" w:line="300"/>
-      </w:pPr>
-      <w:r>
-        <w:rPr>
-          <w:rFonts w:ascii="TH Sarabun New" w:cs="TH Sarabun New" w:eastAsia="TH Sarabun New" w:hAnsi="TH Sarabun New"/>
-          <w:b/>
-          <w:bCs/>
-          <w:color w:val="111827"/>
-          <w:sz w:val="24"/>
-          <w:szCs w:val="24"/>
-        </w:rPr>
-        <w:t xml:space="preserve">2. การตอบสนองที่รวดเร็วแบบทันที (Low Latency Real-time Experience): </w:t>
-      </w:r>
-      <w:r>
-        <w:rPr>
-          <w:rFonts w:ascii="TH Sarabun New" w:cs="TH Sarabun New" w:eastAsia="TH Sarabun New" w:hAnsi="TH Sarabun New"/>
-          <w:color w:val="374151"/>
-          <w:sz w:val="24"/>
-          <w:szCs w:val="24"/>
-        </w:rPr>
-        <w:t xml:space="preserve">การผสมผสานสถาปัตยกรรม WebSockets ร่วมกับ Cloud Database (Turso LibSQL) ทำให้การรับ-ส่งข้อความ การแจ้งเตือน และการอัปเดตสถิติ มีความหน่วงต่ำ (Low Latency) ทำงานได้ราบรื่น</w:t>
-      </w:r>
-    </w:p>
-    <w:p>
-      <w:pPr>
-        <w:pStyle w:val="ListParagraph"/>
-        <w:numPr>
-          <w:ilvl w:val="0"/>
-          <w:numId w:val="1"/>
-        </w:numPr>
-        <w:spacing w:after="40" w:before="40" w:line="300"/>
-      </w:pPr>
-      <w:r>
-        <w:rPr>
-          <w:rFonts w:ascii="TH Sarabun New" w:cs="TH Sarabun New" w:eastAsia="TH Sarabun New" w:hAnsi="TH Sarabun New"/>
-          <w:b/>
-          <w:bCs/>
-          <w:color w:val="111827"/>
-          <w:sz w:val="24"/>
-          <w:szCs w:val="24"/>
-        </w:rPr>
-        <w:t xml:space="preserve">3. การส่งเสริมปฏิสัมพันธ์เชิงคุณภาพ (Activity-driven Connection): </w:t>
-      </w:r>
-      <w:r>
-        <w:rPr>
-          <w:rFonts w:ascii="TH Sarabun New" w:cs="TH Sarabun New" w:eastAsia="TH Sarabun New" w:hAnsi="TH Sarabun New"/>
-          <w:color w:val="374151"/>
-          <w:sz w:val="24"/>
-          <w:szCs w:val="24"/>
-        </w:rPr>
-        <w:t xml:space="preserve">ระบบเน้นการเชื่อมต่อผ่านกิจกรรมในชีวิตจริง (Real-life Activities) มากกว่าการตัดสินจากรูปลักษณ์ภายนอกเพียงอย่างเดียว ช่วยลดความประหม่าในการเริ่มต้นสร้างมิตรภาพของนักศึกษา</w:t>
-      </w:r>
-    </w:p>
-    <w:p>
-      <w:pPr>
-        <w:pStyle w:val="ListParagraph"/>
-        <w:numPr>
-          <w:ilvl w:val="0"/>
-          <w:numId w:val="1"/>
-        </w:numPr>
-        <w:spacing w:after="40" w:before="40" w:line="300"/>
-      </w:pPr>
-      <w:r>
-        <w:rPr>
-          <w:rFonts w:ascii="TH Sarabun New" w:cs="TH Sarabun New" w:eastAsia="TH Sarabun New" w:hAnsi="TH Sarabun New"/>
-          <w:b/>
-          <w:bCs/>
-          <w:color w:val="111827"/>
-          <w:sz w:val="24"/>
-          <w:szCs w:val="24"/>
-        </w:rPr>
-        <w:t xml:space="preserve">4. ความสามารถในการบริหารจัดการเชิงรุก (Data-driven Administration): </w:t>
-      </w:r>
-      <w:r>
-        <w:rPr>
-          <w:rFonts w:ascii="TH Sarabun New" w:cs="TH Sarabun New" w:eastAsia="TH Sarabun New" w:hAnsi="TH Sarabun New"/>
-          <w:color w:val="374151"/>
-          <w:sz w:val="24"/>
-          <w:szCs w:val="24"/>
-        </w:rPr>
-        <w:t xml:space="preserve">หน้าแดชบอร์ดที่แสดงสถิติผู้เข้าชมและช่วงเวลาพีค (Peak Hours) ช่วยให้ผู้ดูแลระบบสามารถวางแผนจัดกิจกรรมหรือส่งประกาศประชาสัมพันธ์ในช่วงเวลาที่นักศึกษาเข้าใช้งานหนาแน่นที่สุดได้อย่างแม่นยำ</w:t>
-      </w:r>
-    </w:p>
-    <w:p>
-      <w:pPr>
-        <w:pStyle w:val="Heading2"/>
-        <w:spacing w:after="80" w:before="180"/>
-      </w:pPr>
-      <w:r>
-        <w:rPr>
-          <w:rFonts w:ascii="TH Sarabun New" w:cs="TH Sarabun New" w:eastAsia="TH Sarabun New" w:hAnsi="TH Sarabun New"/>
-          <w:b/>
-          <w:bCs/>
-          <w:color w:val="374151"/>
-          <w:sz w:val="28"/>
-          <w:szCs w:val="28"/>
-        </w:rPr>
-        <w:t xml:space="preserve">6.2 จุดที่ควรพัฒนาต่อ (Areas for Improvement)</w:t>
-      </w:r>
-    </w:p>
-    <w:p>
-      <w:pPr>
-        <w:pStyle w:val="ListParagraph"/>
-        <w:numPr>
-          <w:ilvl w:val="0"/>
-          <w:numId w:val="1"/>
-        </w:numPr>
-        <w:spacing w:after="40" w:before="40" w:line="300"/>
-      </w:pPr>
-      <w:r>
-        <w:rPr>
-          <w:rFonts w:ascii="TH Sarabun New" w:cs="TH Sarabun New" w:eastAsia="TH Sarabun New" w:hAnsi="TH Sarabun New"/>
-          <w:b/>
-          <w:bCs/>
-          <w:color w:val="111827"/>
-          <w:sz w:val="24"/>
-          <w:szCs w:val="24"/>
-        </w:rPr>
-        <w:t xml:space="preserve">1. การใช้อัลกอริทึมปัญญาประดิษฐ์ขั้นสูงในการจับคู่ (AI/ML-based Matching): </w:t>
-      </w:r>
-      <w:r>
-        <w:rPr>
-          <w:rFonts w:ascii="TH Sarabun New" w:cs="TH Sarabun New" w:eastAsia="TH Sarabun New" w:hAnsi="TH Sarabun New"/>
-          <w:color w:val="374151"/>
-          <w:sz w:val="24"/>
-          <w:szCs w:val="24"/>
-        </w:rPr>
-        <w:t xml:space="preserve">ปัจจุบันการจับคู่ยังใช้การเปรียบเทียบชุดข้อมูลตรงตัว (Rule-based Matching) ซึ่งในอนาคตควรนำเทคนิคการประมวลผลภาษาธรรมชาติ (NLP) หรือ Collaborative Filtering มาช่วยวิเคราะห์เนื้อหา Bio และพฤติกรรมเพื่อการแนะนำที่แม่นยำยิ่งขึ้น</w:t>
-      </w:r>
-    </w:p>
-    <w:p>
-      <w:pPr>
-        <w:pStyle w:val="ListParagraph"/>
-        <w:numPr>
-          <w:ilvl w:val="0"/>
-          <w:numId w:val="1"/>
-        </w:numPr>
-        <w:spacing w:after="40" w:before="40" w:line="300"/>
-      </w:pPr>
-      <w:r>
-        <w:rPr>
-          <w:rFonts w:ascii="TH Sarabun New" w:cs="TH Sarabun New" w:eastAsia="TH Sarabun New" w:hAnsi="TH Sarabun New"/>
-          <w:b/>
-          <w:bCs/>
-          <w:color w:val="111827"/>
-          <w:sz w:val="24"/>
-          <w:szCs w:val="24"/>
-        </w:rPr>
-        <w:t xml:space="preserve">2. ระบบการแจ้งเตือนแบบพุชอย่างสมบูรณ์ (Full Progressive Web Push): </w:t>
-      </w:r>
-      <w:r>
-        <w:rPr>
-          <w:rFonts w:ascii="TH Sarabun New" w:cs="TH Sarabun New" w:eastAsia="TH Sarabun New" w:hAnsi="TH Sarabun New"/>
-          <w:color w:val="374151"/>
-          <w:sz w:val="24"/>
-          <w:szCs w:val="24"/>
-        </w:rPr>
-        <w:t xml:space="preserve">แม้ระบบจะรองรับ PWA และการแจ้งเตือนพื้นฐานแล้ว แต่ยังมีข้อจำกัดบนระบบปฏิบัติการ iOS ในบางเวอร์ชันที่ต้องกำหนดค่าเฉพาะ จึงควรพัฒนาเป็น Native Application ในอนาคต</w:t>
-      </w:r>
-    </w:p>
-    <w:p>
-      <w:pPr>
-        <w:pStyle w:val="ListParagraph"/>
-        <w:numPr>
-          <w:ilvl w:val="0"/>
-          <w:numId w:val="1"/>
-        </w:numPr>
-        <w:spacing w:after="40" w:before="40" w:line="300"/>
-      </w:pPr>
-      <w:r>
-        <w:rPr>
-          <w:rFonts w:ascii="TH Sarabun New" w:cs="TH Sarabun New" w:eastAsia="TH Sarabun New" w:hAnsi="TH Sarabun New"/>
-          <w:b/>
-          <w:bCs/>
-          <w:color w:val="111827"/>
-          <w:sz w:val="24"/>
-          <w:szCs w:val="24"/>
-        </w:rPr>
-        <w:t xml:space="preserve">3. ระบบการสื่อสารด้วยเสียงและภาพ (Voice &amp; Video Calls): </w:t>
-      </w:r>
-      <w:r>
-        <w:rPr>
-          <w:rFonts w:ascii="TH Sarabun New" w:cs="TH Sarabun New" w:eastAsia="TH Sarabun New" w:hAnsi="TH Sarabun New"/>
-          <w:color w:val="374151"/>
-          <w:sz w:val="24"/>
-          <w:szCs w:val="24"/>
-        </w:rPr>
-        <w:t xml:space="preserve">ควรเพิ่มระบบ WebRTC สำหรับการโทรคุยด้วยเสียงหรือวิดีโอคอล เพื่อเพิ่มทางเลือกในการทำความรู้จักก่อนนัดพบตัวจริง</w:t>
-      </w:r>
-    </w:p>
-    <w:p>
-      <w:pPr>
-        <w:pStyle w:val="Heading2"/>
-        <w:spacing w:after="80" w:before="180"/>
-      </w:pPr>
-      <w:r>
-        <w:rPr>
-          <w:rFonts w:ascii="TH Sarabun New" w:cs="TH Sarabun New" w:eastAsia="TH Sarabun New" w:hAnsi="TH Sarabun New"/>
-          <w:b/>
-          <w:bCs/>
-          <w:color w:val="374151"/>
-          <w:sz w:val="28"/>
-          <w:szCs w:val="28"/>
-        </w:rPr>
-        <w:t xml:space="preserve">6.3 ข้อจำกัดของโครงการ (Limitations)</w:t>
-      </w:r>
-    </w:p>
-    <w:p>
-      <w:pPr>
-        <w:pStyle w:val="ListParagraph"/>
-        <w:numPr>
-          <w:ilvl w:val="0"/>
-          <w:numId w:val="1"/>
-        </w:numPr>
-        <w:spacing w:after="40" w:before="40" w:line="300"/>
-      </w:pPr>
-      <w:r>
-        <w:rPr>
-          <w:rFonts w:ascii="TH Sarabun New" w:cs="TH Sarabun New" w:eastAsia="TH Sarabun New" w:hAnsi="TH Sarabun New"/>
-          <w:b/>
-          <w:bCs/>
-          <w:color w:val="111827"/>
-          <w:sz w:val="24"/>
-          <w:szCs w:val="24"/>
-        </w:rPr>
-        <w:t xml:space="preserve">1. ขอบเขตการเข้าถึงผู้ใช้งาน: </w:t>
-      </w:r>
-      <w:r>
-        <w:rPr>
-          <w:rFonts w:ascii="TH Sarabun New" w:cs="TH Sarabun New" w:eastAsia="TH Sarabun New" w:hAnsi="TH Sarabun New"/>
-          <w:color w:val="374151"/>
-          <w:sz w:val="24"/>
-          <w:szCs w:val="24"/>
-        </w:rPr>
-        <w:t xml:space="preserve">ระบบถูกจำกัดสิทธิ์ให้ใช้งานได้เฉพาะนักศึกษาที่มีอีเมลของสถาบันที่กำหนดเท่านั้น จึงไม่สามารถขยายผลไปยังบุคคลทั่วไปหรือนักศึกษาต่างสถาบันได้ในทันที</w:t>
-      </w:r>
-    </w:p>
-    <w:p>
-      <w:pPr>
-        <w:pStyle w:val="ListParagraph"/>
-        <w:numPr>
-          <w:ilvl w:val="0"/>
-          <w:numId w:val="1"/>
-        </w:numPr>
-        <w:spacing w:after="40" w:before="40" w:line="300"/>
-      </w:pPr>
-      <w:r>
-        <w:rPr>
-          <w:rFonts w:ascii="TH Sarabun New" w:cs="TH Sarabun New" w:eastAsia="TH Sarabun New" w:hAnsi="TH Sarabun New"/>
-          <w:b/>
-          <w:bCs/>
-          <w:color w:val="111827"/>
-          <w:sz w:val="24"/>
-          <w:szCs w:val="24"/>
-        </w:rPr>
-        <w:t xml:space="preserve">2. ข้อจำกัดด้านโครงสร้างพื้นฐานคลาวด์: </w:t>
-      </w:r>
-      <w:r>
-        <w:rPr>
-          <w:rFonts w:ascii="TH Sarabun New" w:cs="TH Sarabun New" w:eastAsia="TH Sarabun New" w:hAnsi="TH Sarabun New"/>
-          <w:color w:val="374151"/>
-          <w:sz w:val="24"/>
-          <w:szCs w:val="24"/>
-        </w:rPr>
-        <w:t xml:space="preserve">ระบบใช้บริการฐานข้อมูลและเซิร์ฟเวอร์แบบกระจายตัว ซึ่งจำเป็นต้องพึ่งพาการเชื่อมต่ออินเทอร์เน็ตที่เสถียร หากเครือข่ายของผู้ใช้มีความเร็วต่ำ การเชื่อมต่อ Socket อาจเกิดการหลุดและต้องเชื่อมต่อใหม่ (Reconnection)</w:t>
+        <w:t xml:space="preserve">5. ผลการดำเนินงาน (Results)</w:t>
+      </w:r>
+    </w:p>
+    <w:p>
+      <w:pPr>
+        <w:spacing w:after="60" w:before="60" w:line="320"/>
+      </w:pPr>
+      <w:r>
+        <w:rPr>
+          <w:rFonts w:ascii="TH Sarabun New" w:cs="TH Sarabun New" w:eastAsia="TH Sarabun New" w:hAnsi="TH Sarabun New"/>
+          <w:color w:val="1F2937"/>
+          <w:sz w:val="24"/>
+          <w:szCs w:val="24"/>
+        </w:rPr>
+        <w:t xml:space="preserve">การพัฒนาเว็บแอปพลิเคชัน MatchSpace มีผลการดำเนินงานที่เสร็จสมบูรณ์ตามขอบเขตและวัตถุประสงค์ของโครงการ โดยระบบสามารถทำงานได้อย่างมีเสถียรภาพ รองรับการใช้งานแบบ Responsive Web Application ทั้งบนคอมพิวเตอร์และสมาร์ทโฟน โดยมีขั้นตอนการใช้งานและฟังก์ชันหลักของระบบ แบ่งออกเป็นแต่ละด้าน ดังนี้</w:t>
+      </w:r>
+    </w:p>
+    <w:p>
+      <w:pPr>
+        <w:pStyle w:val="ListParagraph"/>
+        <w:numPr>
+          <w:ilvl w:val="0"/>
+          <w:numId w:val="1"/>
+        </w:numPr>
+        <w:spacing w:after="40" w:before="40" w:line="300"/>
+      </w:pPr>
+      <w:r>
+        <w:rPr>
+          <w:rFonts w:ascii="TH Sarabun New" w:cs="TH Sarabun New" w:eastAsia="TH Sarabun New" w:hAnsi="TH Sarabun New"/>
+          <w:b/>
+          <w:bCs/>
+          <w:color w:val="111827"/>
+          <w:sz w:val="24"/>
+          <w:szCs w:val="24"/>
+        </w:rPr>
+        <w:t xml:space="preserve">1. ระบบการลงทะเบียนและการยืนยันตัวตนนักศึกษา (Authentication &amp; Verification): </w:t>
+      </w:r>
+      <w:r>
+        <w:rPr>
+          <w:rFonts w:ascii="TH Sarabun New" w:cs="TH Sarabun New" w:eastAsia="TH Sarabun New" w:hAnsi="TH Sarabun New"/>
+          <w:color w:val="374151"/>
+          <w:sz w:val="24"/>
+          <w:szCs w:val="24"/>
+        </w:rPr>
+        <w:t xml:space="preserve">ผู้ใช้สามารถลงทะเบียนและเข้าสู่ระบบด้วยอีเมลและรหัสผ่าน หรือผ่านระบบ Google Sign-In โดยมีระบบความปลอดภัยผ่านการยืนยันรหัสนักศึกษาด้วยรหัสผ่านใช้ครั้งเดียว (OTP) ที่ส่งไปยังอีเมลทางการของมหาวิทยาลัย (@kkumail.com หรือโดเมน .ac.th) เพื่อคัดกรองเฉพาะนักศึกษาจริงในสถาบันและป้องกันปัญหาบัญชีปลอม</w:t>
+      </w:r>
+    </w:p>
+    <w:p>
+      <w:pPr>
+        <w:pStyle w:val="ListParagraph"/>
+        <w:numPr>
+          <w:ilvl w:val="0"/>
+          <w:numId w:val="1"/>
+        </w:numPr>
+        <w:spacing w:after="40" w:before="40" w:line="300"/>
+      </w:pPr>
+      <w:r>
+        <w:rPr>
+          <w:rFonts w:ascii="TH Sarabun New" w:cs="TH Sarabun New" w:eastAsia="TH Sarabun New" w:hAnsi="TH Sarabun New"/>
+          <w:b/>
+          <w:bCs/>
+          <w:color w:val="111827"/>
+          <w:sz w:val="24"/>
+          <w:szCs w:val="24"/>
+        </w:rPr>
+        <w:t xml:space="preserve">2. ระบบจัดการโปรไฟล์และระบุความสนใจ (Profile &amp; Lifestyle Customization): </w:t>
+      </w:r>
+      <w:r>
+        <w:rPr>
+          <w:rFonts w:ascii="TH Sarabun New" w:cs="TH Sarabun New" w:eastAsia="TH Sarabun New" w:hAnsi="TH Sarabun New"/>
+          <w:color w:val="374151"/>
+          <w:sz w:val="24"/>
+          <w:szCs w:val="24"/>
+        </w:rPr>
+        <w:t xml:space="preserve">ผู้ใช้งานสามารถกรอกข้อมูลส่วนตัว คณะ ชั้นปี วันเดือนปีเกิด อัตลักษณ์เพศ และความสนใจทางเพศ พร้อมทั้งเลือกแท็กความสนใจ (Lifestyle Tags) เช่น ดนตรี กีฬา การอ่าน คาเฟ่ เกม อนิเมะ เพื่อนำข้อมูลไปใช้ในระบบประมวลผลความเข้ากันได้</w:t>
+      </w:r>
+    </w:p>
+    <w:p>
+      <w:pPr>
+        <w:pStyle w:val="ListParagraph"/>
+        <w:numPr>
+          <w:ilvl w:val="0"/>
+          <w:numId w:val="1"/>
+        </w:numPr>
+        <w:spacing w:after="40" w:before="40" w:line="300"/>
+      </w:pPr>
+      <w:r>
+        <w:rPr>
+          <w:rFonts w:ascii="TH Sarabun New" w:cs="TH Sarabun New" w:eastAsia="TH Sarabun New" w:hAnsi="TH Sarabun New"/>
+          <w:b/>
+          <w:bCs/>
+          <w:color w:val="111827"/>
+          <w:sz w:val="24"/>
+          <w:szCs w:val="24"/>
+        </w:rPr>
+        <w:t xml:space="preserve">3. ระบบค้นหาและจับคู่ความสนใจ (Smart Matching System): </w:t>
+      </w:r>
+      <w:r>
+        <w:rPr>
+          <w:rFonts w:ascii="TH Sarabun New" w:cs="TH Sarabun New" w:eastAsia="TH Sarabun New" w:hAnsi="TH Sarabun New"/>
+          <w:color w:val="374151"/>
+          <w:sz w:val="24"/>
+          <w:szCs w:val="24"/>
+        </w:rPr>
+        <w:t xml:space="preserve">แสดงการ์ดข้อมูลโปรไฟล์ของผู้ใช้งานรายอื่นพร้อมระดับเปอร์เซ็นต์ความสอดคล้องของความสนใจ (Matching Compatibility Score) โดยผู้ใช้สามารถเลือกส่งคำขอเชื่อมต่อ (Connect/Like) หรือข้ามโปรไฟล์ เมื่อทั้งสองฝ่ายให้ความสนใจตรงกัน ระบบจะสร้างห้องสนทนาเพื่อเริ่มต้นพูดคุยโดยอัตโนมัติ</w:t>
+      </w:r>
+    </w:p>
+    <w:p>
+      <w:pPr>
+        <w:pStyle w:val="ListParagraph"/>
+        <w:numPr>
+          <w:ilvl w:val="0"/>
+          <w:numId w:val="1"/>
+        </w:numPr>
+        <w:spacing w:after="40" w:before="40" w:line="300"/>
+      </w:pPr>
+      <w:r>
+        <w:rPr>
+          <w:rFonts w:ascii="TH Sarabun New" w:cs="TH Sarabun New" w:eastAsia="TH Sarabun New" w:hAnsi="TH Sarabun New"/>
+          <w:b/>
+          <w:bCs/>
+          <w:color w:val="111827"/>
+          <w:sz w:val="24"/>
+          <w:szCs w:val="24"/>
+        </w:rPr>
+        <w:t xml:space="preserve">4. ระบบการสนทนาแบบทันที (Real-time Messaging System): </w:t>
+      </w:r>
+      <w:r>
+        <w:rPr>
+          <w:rFonts w:ascii="TH Sarabun New" w:cs="TH Sarabun New" w:eastAsia="TH Sarabun New" w:hAnsi="TH Sarabun New"/>
+          <w:color w:val="374151"/>
+          <w:sz w:val="24"/>
+          <w:szCs w:val="24"/>
+        </w:rPr>
+        <w:t xml:space="preserve">รองรับการรับ-ส่งข้อความและรูปภาพแบบทันที (Real-time) ผ่านเทคโนโลยี WebSockets พร้อมแสดงสถานะการอ่านข้อความ (Read Receipts) ระบุวัน-เวลาที่อ่าน รองรับทั้งการสนทนาส่วนตัว 1 ต่อ 1 และการสนทนากลุ่มย่อยตามกิจกรรม</w:t>
+      </w:r>
+    </w:p>
+    <w:p>
+      <w:pPr>
+        <w:pStyle w:val="ListParagraph"/>
+        <w:numPr>
+          <w:ilvl w:val="0"/>
+          <w:numId w:val="1"/>
+        </w:numPr>
+        <w:spacing w:after="40" w:before="40" w:line="300"/>
+      </w:pPr>
+      <w:r>
+        <w:rPr>
+          <w:rFonts w:ascii="TH Sarabun New" w:cs="TH Sarabun New" w:eastAsia="TH Sarabun New" w:hAnsi="TH Sarabun New"/>
+          <w:b/>
+          <w:bCs/>
+          <w:color w:val="111827"/>
+          <w:sz w:val="24"/>
+          <w:szCs w:val="24"/>
+        </w:rPr>
+        <w:t xml:space="preserve">5. ระบบสร้างและเข้าร่วมกิจกรรมกลุ่ม (Campus Community &amp; Activity Hub): </w:t>
+      </w:r>
+      <w:r>
+        <w:rPr>
+          <w:rFonts w:ascii="TH Sarabun New" w:cs="TH Sarabun New" w:eastAsia="TH Sarabun New" w:hAnsi="TH Sarabun New"/>
+          <w:color w:val="374151"/>
+          <w:sz w:val="24"/>
+          <w:szCs w:val="24"/>
+        </w:rPr>
+        <w:t xml:space="preserve">ผู้ใช้งานสามารถเปิดสร้างกิจกรรมสาธารณะภายในมหาวิทยาลัย เช่น กิจกรรมชวนอ่านหนังสือ ติวสอบ ไปคาเฟ่ หรือเล่นกีฬา โดยผู้ใช้อื่นสามารถส่งคำขอเข้าร่วม มีระบบจำกัดจำนวนคน และเปิดห้องแชตกลุ่มสำหรับกิจกรรมนั้น ๆ โดยอัตโนมัติ</w:t>
+      </w:r>
+    </w:p>
+    <w:p>
+      <w:pPr>
+        <w:pStyle w:val="ListParagraph"/>
+        <w:numPr>
+          <w:ilvl w:val="0"/>
+          <w:numId w:val="1"/>
+        </w:numPr>
+        <w:spacing w:after="40" w:before="40" w:line="300"/>
+      </w:pPr>
+      <w:r>
+        <w:rPr>
+          <w:rFonts w:ascii="TH Sarabun New" w:cs="TH Sarabun New" w:eastAsia="TH Sarabun New" w:hAnsi="TH Sarabun New"/>
+          <w:b/>
+          <w:bCs/>
+          <w:color w:val="111827"/>
+          <w:sz w:val="24"/>
+          <w:szCs w:val="24"/>
+        </w:rPr>
+        <w:t xml:space="preserve">6. ระบบเหรียญรางวัลประเมินความน่าเชื่อถือ (Gamification &amp; Badges System): </w:t>
+      </w:r>
+      <w:r>
+        <w:rPr>
+          <w:rFonts w:ascii="TH Sarabun New" w:cs="TH Sarabun New" w:eastAsia="TH Sarabun New" w:hAnsi="TH Sarabun New"/>
+          <w:color w:val="374151"/>
+          <w:sz w:val="24"/>
+          <w:szCs w:val="24"/>
+        </w:rPr>
+        <w:t xml:space="preserve">ผู้ใช้สามารถมอบเหรียญตราเกียรติยศ (Badges) ให้แก่เพื่อนคู่สนทนาหรือสมาชิกในกิจกรรม เช่น "เพื่อนติวดีเด่น", "ตรงต่อเวลา", "เป็นมิตรยอดเยี่ยม" เพื่อสร้างสังคมเชิงบวกและเป็นคะแนนประเมินความปลอดภัยของบุคคล</w:t>
+      </w:r>
+    </w:p>
+    <w:p>
+      <w:pPr>
+        <w:pStyle w:val="ListParagraph"/>
+        <w:numPr>
+          <w:ilvl w:val="0"/>
+          <w:numId w:val="1"/>
+        </w:numPr>
+        <w:spacing w:after="40" w:before="40" w:line="300"/>
+      </w:pPr>
+      <w:r>
+        <w:rPr>
+          <w:rFonts w:ascii="TH Sarabun New" w:cs="TH Sarabun New" w:eastAsia="TH Sarabun New" w:hAnsi="TH Sarabun New"/>
+          <w:b/>
+          <w:bCs/>
+          <w:color w:val="111827"/>
+          <w:sz w:val="24"/>
+          <w:szCs w:val="24"/>
+        </w:rPr>
+        <w:t xml:space="preserve">7. ระบบความปลอดภัยและการรายงานปัญหา (Safety, Blocking &amp; Reporting): </w:t>
+      </w:r>
+      <w:r>
+        <w:rPr>
+          <w:rFonts w:ascii="TH Sarabun New" w:cs="TH Sarabun New" w:eastAsia="TH Sarabun New" w:hAnsi="TH Sarabun New"/>
+          <w:color w:val="374151"/>
+          <w:sz w:val="24"/>
+          <w:szCs w:val="24"/>
+        </w:rPr>
+        <w:t xml:space="preserve">ผู้ใช้สามารถปิดกั้น (Block) ผู้ใช้ที่มีพฤติกรรมไม่เหมาะสมได้ทันที และมีระบบรายงานปัญหา (Report System) พร้อมแนบหลักฐานภาพถ่าย เพื่อส่งให้ผู้ดูแลระบบตรวจสอบข้อเท็จจริง</w:t>
+      </w:r>
+    </w:p>
+    <w:p>
+      <w:pPr>
+        <w:pStyle w:val="ListParagraph"/>
+        <w:numPr>
+          <w:ilvl w:val="0"/>
+          <w:numId w:val="1"/>
+        </w:numPr>
+        <w:spacing w:after="40" w:before="40" w:line="300"/>
+      </w:pPr>
+      <w:r>
+        <w:rPr>
+          <w:rFonts w:ascii="TH Sarabun New" w:cs="TH Sarabun New" w:eastAsia="TH Sarabun New" w:hAnsi="TH Sarabun New"/>
+          <w:b/>
+          <w:bCs/>
+          <w:color w:val="111827"/>
+          <w:sz w:val="24"/>
+          <w:szCs w:val="24"/>
+        </w:rPr>
+        <w:t xml:space="preserve">8. ระบบแดชบอร์ดและการวิเคราะห์สถิติสำหรับผู้ดูแลระบบ (Admin &amp; Analytics Dashboard): </w:t>
+      </w:r>
+      <w:r>
+        <w:rPr>
+          <w:rFonts w:ascii="TH Sarabun New" w:cs="TH Sarabun New" w:eastAsia="TH Sarabun New" w:hAnsi="TH Sarabun New"/>
+          <w:color w:val="374151"/>
+          <w:sz w:val="24"/>
+          <w:szCs w:val="24"/>
+        </w:rPr>
+        <w:t xml:space="preserve">แสดงสถิติเชิงลึกผ่านกราฟ Interactive (Chart.js) จำแนกจำนวนผู้เข้าชมรายวัน (Daily Visitors) ทั้งยอดเปิดหน้า (Pageviews) และผู้ใช้ไม่ซ้ำคน (Unique Visitors) กราฟความหนาแน่น 24 ชั่วโมง (00:00 - 23:00 น.) พร้อมวิเคราะห์ช่วงเวลาที่มีผู้ใช้งานสูงสุด (Peak Usage Hours) สัดส่วนอุปกรณ์ และประวัติการเข้าชมแบบเรียลไทม์</w:t>
       </w:r>
     </w:p>
     <w:p>
       <w:pPr>
         <w:pStyle w:val="Heading1"/>
-        <w:spacing w:after="120" w:before="240"/>
+        <w:spacing w:after="120" w:before="260"/>
       </w:pPr>
       <w:r>
         <w:rPr>
@@ -659,7 +565,7 @@
           <w:sz w:val="32"/>
           <w:szCs w:val="32"/>
         </w:rPr>
-        <w:t xml:space="preserve">7. สรุปและข้อเสนอแนะ (Conclusion &amp; Recommendations)</w:t>
+        <w:t xml:space="preserve">6. อภิปรายผลและข้อจำกัด (Discussion &amp; Limitations)</w:t>
       </w:r>
     </w:p>
     <w:p>
@@ -676,21 +582,127 @@
           <w:sz w:val="28"/>
           <w:szCs w:val="28"/>
         </w:rPr>
-        <w:t xml:space="preserve">7.1 สรุปภาพรวมของโครงการ (Conclusion)</w:t>
-      </w:r>
-    </w:p>
-    <w:p>
-      <w:pPr>
-        <w:spacing w:after="60" w:before="60" w:line="320"/>
-      </w:pPr>
-      <w:r>
-        <w:rPr>
-          <w:rFonts w:ascii="TH Sarabun New" w:cs="TH Sarabun New" w:eastAsia="TH Sarabun New" w:hAnsi="TH Sarabun New"/>
-          <w:color w:val="1F2937"/>
-          <w:sz w:val="24"/>
-          <w:szCs w:val="24"/>
-        </w:rPr>
-        <w:t xml:space="preserve">โครงการพัฒนาเว็บแอปพลิเคชัน MatchSpace ประสบความสำเร็จในการสร้างแพลตฟอร์มชุมชนดิจิทัลที่ปลอดภัยสำหรับนักศึกษามหาวิทยาลัยขอนแก่น ระบบสามารถตอบโจทย์การลดช่องว่างความโดดเดี่ยวในรั้วมหาวิทยาลัย ช่วยให้นักศึกษาค้นหาเพื่อนที่มีความสนใจ สไตล์ชีวิต และเป้าหมายการเรียนที่สอดคล้องกันได้อย่างมีประสิทธิภาพ ผ่านฟังก์ชันการยืนยันตัวตนนักศึกษาจริง การจับคู่โปรไฟล์ การสนทนาแบบเรียลไทม์ และการสร้างกิจกรรมกลุ่มเชิงสร้างสรรค์ นอกจากนี้ยังมีระบบแดชบอร์ดควบคุมความปลอดภัยและวิเคราะห์พฤติกรรมการเข้าชมเว็บที่ช่วยให้ผู้ดูแลระบบติดตามดูแลสังคมออนไลน์ได้อย่างใกล้ชิด</w:t>
+        <w:t xml:space="preserve">6.1 จุดเด่นของระบบ (Strengths)</w:t>
+      </w:r>
+    </w:p>
+    <w:p>
+      <w:pPr>
+        <w:pStyle w:val="ListParagraph"/>
+        <w:numPr>
+          <w:ilvl w:val="0"/>
+          <w:numId w:val="1"/>
+        </w:numPr>
+        <w:spacing w:after="40" w:before="40" w:line="300"/>
+      </w:pPr>
+      <w:r>
+        <w:rPr>
+          <w:rFonts w:ascii="TH Sarabun New" w:cs="TH Sarabun New" w:eastAsia="TH Sarabun New" w:hAnsi="TH Sarabun New"/>
+          <w:b/>
+          <w:bCs/>
+          <w:color w:val="111827"/>
+          <w:sz w:val="24"/>
+          <w:szCs w:val="24"/>
+        </w:rPr>
+        <w:t xml:space="preserve">1. ความน่าเชื่อถือและความปลอดภัยสูง (High Trust &amp; Safety): </w:t>
+      </w:r>
+      <w:r>
+        <w:rPr>
+          <w:rFonts w:ascii="TH Sarabun New" w:cs="TH Sarabun New" w:eastAsia="TH Sarabun New" w:hAnsi="TH Sarabun New"/>
+          <w:color w:val="374151"/>
+          <w:sz w:val="24"/>
+          <w:szCs w:val="24"/>
+        </w:rPr>
+        <w:t xml:space="preserve">การผูกมัดการยืนยันตัวตนด้วยอีเมลสถาบันการศึกษา ช่วยลดปัญหาบัญชีหลุม (Fake Accounts) และการหลอกลวง ซึ่งเป็นจุดอ่อนสำคัญของแอปพลิเคชันหาเพื่อนทั่วไปในท้องตลาด</w:t>
+      </w:r>
+    </w:p>
+    <w:p>
+      <w:pPr>
+        <w:pStyle w:val="ListParagraph"/>
+        <w:numPr>
+          <w:ilvl w:val="0"/>
+          <w:numId w:val="1"/>
+        </w:numPr>
+        <w:spacing w:after="40" w:before="40" w:line="300"/>
+      </w:pPr>
+      <w:r>
+        <w:rPr>
+          <w:rFonts w:ascii="TH Sarabun New" w:cs="TH Sarabun New" w:eastAsia="TH Sarabun New" w:hAnsi="TH Sarabun New"/>
+          <w:b/>
+          <w:bCs/>
+          <w:color w:val="111827"/>
+          <w:sz w:val="24"/>
+          <w:szCs w:val="24"/>
+        </w:rPr>
+        <w:t xml:space="preserve">2. การตอบสนองที่รวดเร็วแบบทันที (Low Latency Real-time Experience): </w:t>
+      </w:r>
+      <w:r>
+        <w:rPr>
+          <w:rFonts w:ascii="TH Sarabun New" w:cs="TH Sarabun New" w:eastAsia="TH Sarabun New" w:hAnsi="TH Sarabun New"/>
+          <w:color w:val="374151"/>
+          <w:sz w:val="24"/>
+          <w:szCs w:val="24"/>
+        </w:rPr>
+        <w:t xml:space="preserve">การผสมผสานสถาปัตยกรรม WebSockets ร่วมกับ Cloud Database (Turso LibSQL) ทำให้การรับ-ส่งข้อความ การแจ้งเตือน และการอัปเดตสถิติ มีความหน่วงต่ำ (Low Latency) ทำงานได้ราบรื่น</w:t>
+      </w:r>
+    </w:p>
+    <w:p>
+      <w:pPr>
+        <w:pStyle w:val="ListParagraph"/>
+        <w:numPr>
+          <w:ilvl w:val="0"/>
+          <w:numId w:val="1"/>
+        </w:numPr>
+        <w:spacing w:after="40" w:before="40" w:line="300"/>
+      </w:pPr>
+      <w:r>
+        <w:rPr>
+          <w:rFonts w:ascii="TH Sarabun New" w:cs="TH Sarabun New" w:eastAsia="TH Sarabun New" w:hAnsi="TH Sarabun New"/>
+          <w:b/>
+          <w:bCs/>
+          <w:color w:val="111827"/>
+          <w:sz w:val="24"/>
+          <w:szCs w:val="24"/>
+        </w:rPr>
+        <w:t xml:space="preserve">3. การส่งเสริมปฏิสัมพันธ์เชิงคุณภาพ (Activity-driven Connection): </w:t>
+      </w:r>
+      <w:r>
+        <w:rPr>
+          <w:rFonts w:ascii="TH Sarabun New" w:cs="TH Sarabun New" w:eastAsia="TH Sarabun New" w:hAnsi="TH Sarabun New"/>
+          <w:color w:val="374151"/>
+          <w:sz w:val="24"/>
+          <w:szCs w:val="24"/>
+        </w:rPr>
+        <w:t xml:space="preserve">ระบบเน้นการเชื่อมต่อผ่านกิจกรรมในชีวิตจริง (Real-life Activities) มากกว่าการตัดสินจากรูปลักษณ์ภายนอกเพียงอย่างเดียว ช่วยลดความประหม่าในการเริ่มต้นสร้างมิตรภาพของนักศึกษา</w:t>
+      </w:r>
+    </w:p>
+    <w:p>
+      <w:pPr>
+        <w:pStyle w:val="ListParagraph"/>
+        <w:numPr>
+          <w:ilvl w:val="0"/>
+          <w:numId w:val="1"/>
+        </w:numPr>
+        <w:spacing w:after="40" w:before="40" w:line="300"/>
+      </w:pPr>
+      <w:r>
+        <w:rPr>
+          <w:rFonts w:ascii="TH Sarabun New" w:cs="TH Sarabun New" w:eastAsia="TH Sarabun New" w:hAnsi="TH Sarabun New"/>
+          <w:b/>
+          <w:bCs/>
+          <w:color w:val="111827"/>
+          <w:sz w:val="24"/>
+          <w:szCs w:val="24"/>
+        </w:rPr>
+        <w:t xml:space="preserve">4. ความสามารถในการบริหารจัดการเชิงรุก (Data-driven Administration): </w:t>
+      </w:r>
+      <w:r>
+        <w:rPr>
+          <w:rFonts w:ascii="TH Sarabun New" w:cs="TH Sarabun New" w:eastAsia="TH Sarabun New" w:hAnsi="TH Sarabun New"/>
+          <w:color w:val="374151"/>
+          <w:sz w:val="24"/>
+          <w:szCs w:val="24"/>
+        </w:rPr>
+        <w:t xml:space="preserve">หน้าแดชบอร์ดที่แสดงสถิติผู้เข้าชมและช่วงเวลาพีค (Peak Hours) ช่วยให้ผู้ดูแลระบบสามารถวางแผนจัดกิจกรรมหรือส่งประกาศประชาสัมพันธ์ในช่วงเวลาที่นักศึกษาเข้าใช้งานหนาแน่นที่สุดได้อย่างแม่นยำ</w:t>
       </w:r>
     </w:p>
     <w:p>
@@ -707,6 +719,238 @@
           <w:sz w:val="28"/>
           <w:szCs w:val="28"/>
         </w:rPr>
+        <w:t xml:space="preserve">6.2 จุดที่ควรพัฒนาต่อ (Areas for Improvement)</w:t>
+      </w:r>
+    </w:p>
+    <w:p>
+      <w:pPr>
+        <w:pStyle w:val="ListParagraph"/>
+        <w:numPr>
+          <w:ilvl w:val="0"/>
+          <w:numId w:val="1"/>
+        </w:numPr>
+        <w:spacing w:after="40" w:before="40" w:line="300"/>
+      </w:pPr>
+      <w:r>
+        <w:rPr>
+          <w:rFonts w:ascii="TH Sarabun New" w:cs="TH Sarabun New" w:eastAsia="TH Sarabun New" w:hAnsi="TH Sarabun New"/>
+          <w:b/>
+          <w:bCs/>
+          <w:color w:val="111827"/>
+          <w:sz w:val="24"/>
+          <w:szCs w:val="24"/>
+        </w:rPr>
+        <w:t xml:space="preserve">1. การใช้อัลกอริทึมปัญญาประดิษฐ์ขั้นสูงในการจับคู่ (AI/ML-based Matching): </w:t>
+      </w:r>
+      <w:r>
+        <w:rPr>
+          <w:rFonts w:ascii="TH Sarabun New" w:cs="TH Sarabun New" w:eastAsia="TH Sarabun New" w:hAnsi="TH Sarabun New"/>
+          <w:color w:val="374151"/>
+          <w:sz w:val="24"/>
+          <w:szCs w:val="24"/>
+        </w:rPr>
+        <w:t xml:space="preserve">ปัจจุบันการจับคู่ยังใช้การเปรียบเทียบชุดข้อมูลตรงตัว (Rule-based Matching) ซึ่งในอนาคตควรนำเทคนิคการประมวลผลภาษาธรรมชาติ (NLP) หรือ Collaborative Filtering มาช่วยวิเคราะห์เนื้อหา Bio และพฤติกรรมเพื่อการแนะนำที่แม่นยำยิ่งขึ้น</w:t>
+      </w:r>
+    </w:p>
+    <w:p>
+      <w:pPr>
+        <w:pStyle w:val="ListParagraph"/>
+        <w:numPr>
+          <w:ilvl w:val="0"/>
+          <w:numId w:val="1"/>
+        </w:numPr>
+        <w:spacing w:after="40" w:before="40" w:line="300"/>
+      </w:pPr>
+      <w:r>
+        <w:rPr>
+          <w:rFonts w:ascii="TH Sarabun New" w:cs="TH Sarabun New" w:eastAsia="TH Sarabun New" w:hAnsi="TH Sarabun New"/>
+          <w:b/>
+          <w:bCs/>
+          <w:color w:val="111827"/>
+          <w:sz w:val="24"/>
+          <w:szCs w:val="24"/>
+        </w:rPr>
+        <w:t xml:space="preserve">2. ระบบการแจ้งเตือนแบบพุชอย่างสมบูรณ์ (Full Progressive Web Push): </w:t>
+      </w:r>
+      <w:r>
+        <w:rPr>
+          <w:rFonts w:ascii="TH Sarabun New" w:cs="TH Sarabun New" w:eastAsia="TH Sarabun New" w:hAnsi="TH Sarabun New"/>
+          <w:color w:val="374151"/>
+          <w:sz w:val="24"/>
+          <w:szCs w:val="24"/>
+        </w:rPr>
+        <w:t xml:space="preserve">แม้ระบบจะรองรับ PWA และการแจ้งเตือนพื้นฐานแล้ว แต่ยังมีข้อจำกัดบนระบบปฏิบัติการ iOS ในบางเวอร์ชันที่ต้องกำหนดค่าเฉพาะ จึงควรพัฒนาเป็น Native Application ในอนาคต</w:t>
+      </w:r>
+    </w:p>
+    <w:p>
+      <w:pPr>
+        <w:pStyle w:val="ListParagraph"/>
+        <w:numPr>
+          <w:ilvl w:val="0"/>
+          <w:numId w:val="1"/>
+        </w:numPr>
+        <w:spacing w:after="40" w:before="40" w:line="300"/>
+      </w:pPr>
+      <w:r>
+        <w:rPr>
+          <w:rFonts w:ascii="TH Sarabun New" w:cs="TH Sarabun New" w:eastAsia="TH Sarabun New" w:hAnsi="TH Sarabun New"/>
+          <w:b/>
+          <w:bCs/>
+          <w:color w:val="111827"/>
+          <w:sz w:val="24"/>
+          <w:szCs w:val="24"/>
+        </w:rPr>
+        <w:t xml:space="preserve">3. ระบบการสื่อสารด้วยเสียงและภาพ (Voice &amp; Video Calls): </w:t>
+      </w:r>
+      <w:r>
+        <w:rPr>
+          <w:rFonts w:ascii="TH Sarabun New" w:cs="TH Sarabun New" w:eastAsia="TH Sarabun New" w:hAnsi="TH Sarabun New"/>
+          <w:color w:val="374151"/>
+          <w:sz w:val="24"/>
+          <w:szCs w:val="24"/>
+        </w:rPr>
+        <w:t xml:space="preserve">ควรเพิ่มระบบ WebRTC สำหรับการโทรคุยด้วยเสียงหรือวิดีโอคอล เพื่อเพิ่มทางเลือกในการทำความรู้จักก่อนนัดพบตัวจริง</w:t>
+      </w:r>
+    </w:p>
+    <w:p>
+      <w:pPr>
+        <w:pStyle w:val="Heading2"/>
+        <w:spacing w:after="80" w:before="180"/>
+      </w:pPr>
+      <w:r>
+        <w:rPr>
+          <w:rFonts w:ascii="TH Sarabun New" w:cs="TH Sarabun New" w:eastAsia="TH Sarabun New" w:hAnsi="TH Sarabun New"/>
+          <w:b/>
+          <w:bCs/>
+          <w:color w:val="374151"/>
+          <w:sz w:val="28"/>
+          <w:szCs w:val="28"/>
+        </w:rPr>
+        <w:t xml:space="preserve">6.3 ข้อจำกัดของโครงการ (Limitations)</w:t>
+      </w:r>
+    </w:p>
+    <w:p>
+      <w:pPr>
+        <w:pStyle w:val="ListParagraph"/>
+        <w:numPr>
+          <w:ilvl w:val="0"/>
+          <w:numId w:val="1"/>
+        </w:numPr>
+        <w:spacing w:after="40" w:before="40" w:line="300"/>
+      </w:pPr>
+      <w:r>
+        <w:rPr>
+          <w:rFonts w:ascii="TH Sarabun New" w:cs="TH Sarabun New" w:eastAsia="TH Sarabun New" w:hAnsi="TH Sarabun New"/>
+          <w:b/>
+          <w:bCs/>
+          <w:color w:val="111827"/>
+          <w:sz w:val="24"/>
+          <w:szCs w:val="24"/>
+        </w:rPr>
+        <w:t xml:space="preserve">1. ขอบเขตการเข้าถึงผู้ใช้งาน: </w:t>
+      </w:r>
+      <w:r>
+        <w:rPr>
+          <w:rFonts w:ascii="TH Sarabun New" w:cs="TH Sarabun New" w:eastAsia="TH Sarabun New" w:hAnsi="TH Sarabun New"/>
+          <w:color w:val="374151"/>
+          <w:sz w:val="24"/>
+          <w:szCs w:val="24"/>
+        </w:rPr>
+        <w:t xml:space="preserve">ระบบถูกจำกัดสิทธิ์ให้ใช้งานได้เฉพาะนักศึกษาที่มีอีเมลของสถาบันที่กำหนดเท่านั้น จึงไม่สามารถขยายผลไปยังบุคคลทั่วไปหรือนักศึกษาต่างสถาบันได้ในทันที</w:t>
+      </w:r>
+    </w:p>
+    <w:p>
+      <w:pPr>
+        <w:pStyle w:val="ListParagraph"/>
+        <w:numPr>
+          <w:ilvl w:val="0"/>
+          <w:numId w:val="1"/>
+        </w:numPr>
+        <w:spacing w:after="40" w:before="40" w:line="300"/>
+      </w:pPr>
+      <w:r>
+        <w:rPr>
+          <w:rFonts w:ascii="TH Sarabun New" w:cs="TH Sarabun New" w:eastAsia="TH Sarabun New" w:hAnsi="TH Sarabun New"/>
+          <w:b/>
+          <w:bCs/>
+          <w:color w:val="111827"/>
+          <w:sz w:val="24"/>
+          <w:szCs w:val="24"/>
+        </w:rPr>
+        <w:t xml:space="preserve">2. ข้อจำกัดด้านโครงสร้างพื้นฐานคลาวด์: </w:t>
+      </w:r>
+      <w:r>
+        <w:rPr>
+          <w:rFonts w:ascii="TH Sarabun New" w:cs="TH Sarabun New" w:eastAsia="TH Sarabun New" w:hAnsi="TH Sarabun New"/>
+          <w:color w:val="374151"/>
+          <w:sz w:val="24"/>
+          <w:szCs w:val="24"/>
+        </w:rPr>
+        <w:t xml:space="preserve">ระบบใช้บริการฐานข้อมูลและเซิร์ฟเวอร์แบบกระจายตัว ซึ่งจำเป็นต้องพึ่งพาการเชื่อมต่ออินเทอร์เน็ตที่เสถียร หากเครือข่ายของผู้ใช้มีความเร็วต่ำ การเชื่อมต่อ Socket อาจเกิดการหลุดและต้องเชื่อมต่อใหม่ (Reconnection)</w:t>
+      </w:r>
+    </w:p>
+    <w:p>
+      <w:pPr>
+        <w:pStyle w:val="Heading1"/>
+        <w:spacing w:after="120" w:before="260"/>
+      </w:pPr>
+      <w:r>
+        <w:rPr>
+          <w:rFonts w:ascii="TH Sarabun New" w:cs="TH Sarabun New" w:eastAsia="TH Sarabun New" w:hAnsi="TH Sarabun New"/>
+          <w:b/>
+          <w:bCs/>
+          <w:color w:val="1F2937"/>
+          <w:sz w:val="32"/>
+          <w:szCs w:val="32"/>
+        </w:rPr>
+        <w:t xml:space="preserve">7. สรุปและข้อเสนอแนะ (Conclusion &amp; Recommendations)</w:t>
+      </w:r>
+    </w:p>
+    <w:p>
+      <w:pPr>
+        <w:pStyle w:val="Heading2"/>
+        <w:spacing w:after="80" w:before="180"/>
+      </w:pPr>
+      <w:r>
+        <w:rPr>
+          <w:rFonts w:ascii="TH Sarabun New" w:cs="TH Sarabun New" w:eastAsia="TH Sarabun New" w:hAnsi="TH Sarabun New"/>
+          <w:b/>
+          <w:bCs/>
+          <w:color w:val="374151"/>
+          <w:sz w:val="28"/>
+          <w:szCs w:val="28"/>
+        </w:rPr>
+        <w:t xml:space="preserve">7.1 สรุปภาพรวมของโครงการ (Conclusion)</w:t>
+      </w:r>
+    </w:p>
+    <w:p>
+      <w:pPr>
+        <w:spacing w:after="60" w:before="60" w:line="320"/>
+      </w:pPr>
+      <w:r>
+        <w:rPr>
+          <w:rFonts w:ascii="TH Sarabun New" w:cs="TH Sarabun New" w:eastAsia="TH Sarabun New" w:hAnsi="TH Sarabun New"/>
+          <w:color w:val="1F2937"/>
+          <w:sz w:val="24"/>
+          <w:szCs w:val="24"/>
+        </w:rPr>
+        <w:t xml:space="preserve">โครงการพัฒนาเว็บแอปพลิเคชัน MatchSpace ประสบความสำเร็จในการสร้างแพลตฟอร์มชุมชนดิจิทัลที่ปลอดภัยสำหรับนักศึกษามหาวิทยาลัยขอนแก่น ระบบสามารถตอบโจทย์การลดช่องว่างความโดดเดี่ยวในรั้วมหาวิทยาลัย ช่วยให้นักศึกษาค้นหาเพื่อนที่มีความสนใจ สไตล์ชีวิต และเป้าหมายการเรียนที่สอดคล้องกันได้อย่างมีประสิทธิภาพ ผ่านฟังก์ชันการยืนยันตัวตนนักศึกษาจริง การจับคู่โปรไฟล์ การสนทนาแบบเรียลไทม์ และการสร้างกิจกรรมกลุ่มเชิงสร้างสรรค์ นอกจากนี้ยังมีระบบแดชบอร์ดควบคุมความปลอดภัยและวิเคราะห์พฤติกรรมการเข้าชมเว็บที่ช่วยให้ผู้ดูแลระบบติดตามดูแลสังคมออนไลน์ได้อย่างใกล้ชิด</w:t>
+      </w:r>
+    </w:p>
+    <w:p>
+      <w:pPr>
+        <w:pStyle w:val="Heading2"/>
+        <w:spacing w:after="80" w:before="180"/>
+      </w:pPr>
+      <w:r>
+        <w:rPr>
+          <w:rFonts w:ascii="TH Sarabun New" w:cs="TH Sarabun New" w:eastAsia="TH Sarabun New" w:hAnsi="TH Sarabun New"/>
+          <w:b/>
+          <w:bCs/>
+          <w:color w:val="374151"/>
+          <w:sz w:val="28"/>
+          <w:szCs w:val="28"/>
+        </w:rPr>
         <w:t xml:space="preserve">7.2 ข้อเสนอแนะสำหรับการพัฒนาต่อ (Recommendations)</w:t>
       </w:r>
     </w:p>
@@ -803,7 +1047,7 @@
     <w:p>
       <w:pPr>
         <w:pStyle w:val="Heading1"/>
-        <w:spacing w:after="120" w:before="240"/>
+        <w:spacing w:after="120" w:before="260"/>
       </w:pPr>
       <w:r>
         <w:rPr>
@@ -1285,7 +1529,7 @@
           <w:sz w:val="20"/>
           <w:szCs w:val="20"/>
         </w:rPr>
-        <w:t xml:space="preserve">--- สิ้นสุดเอกสาร MatchSpace Manuscript Sections 5-8 ---</w:t>
+        <w:t xml:space="preserve">--- สิ้นสุดเอกสาร MatchSpace Manuscript Sections 4-8 ---</w:t>
       </w:r>
     </w:p>
     <w:sectPr>

</xml_diff>